<commit_message>
more updates to first lectures
</commit_message>
<xml_diff>
--- a/BiomedicalDataScience_Syllabus.docx
+++ b/BiomedicalDataScience_Syllabus.docx
@@ -134,11 +134,11 @@
         <w:pStyle w:val="FirstParagraph"/>
       </w:pPr>
       <w:r>
-        <w:t xml:space="preserve">This class will be taught virtually using a synchronous remote modality, although students will be provided a classroom to gather for each lecture. A co-instructor will be present in the classroom for each lecture. Class will occur Mondays and Wednesdays from 10:00am-12:00pm. Courses may also be recorded and made available for students who need to miss classes due to personal reasons, illness, or research related needs.</w:t>
+        <w:t xml:space="preserve">This class will be taught virtually using a synchronous remote modality, although students will be provided a classroom to gather for each lecture. A co-instructor will be present in the classroom for each lecture. Class will occur Mondays and Wednesdays from 12:00pm-1:50pm. Courses may also be recorded and made available for students who need to miss classes due to personal reasons, illness, or research related needs.</w:t>
       </w:r>
     </w:p>
     <w:bookmarkEnd w:id="23"/>
-    <w:bookmarkStart w:id="24" w:name="zoom-link-and-classroom"/>
+    <w:bookmarkStart w:id="25" w:name="zoom-link-and-classroom"/>
     <w:p>
       <w:pPr>
         <w:pStyle w:val="Heading2"/>
@@ -152,19 +152,30 @@
         <w:pStyle w:val="FirstParagraph"/>
       </w:pPr>
       <w:r>
-        <w:t xml:space="preserve">Zoom Meeting ID for all sessions is Meeting ID: TBD, with the password: TBD, or use the following direct link (the link is also available though the course GitHub page): TBD</w:t>
-      </w:r>
+        <w:t xml:space="preserve">Zoom Meeting ID for all sessions is Meeting ID: 929 7046 3934, with the password: 850292, or use the following direct link (the link is also available though the course GitHub page):</w:t>
+      </w:r>
+      <w:r>
+        <w:t xml:space="preserve"> </w:t>
+      </w:r>
+      <w:hyperlink r:id="rId24">
+        <w:r>
+          <w:rPr>
+            <w:rStyle w:val="Hyperlink"/>
+          </w:rPr>
+          <w:t xml:space="preserve">https://rutgers.zoom.us/j/92970463934?pwd=wVF7nGblCNaAMon3fFlRwboSgEiDUg.1</w:t>
+        </w:r>
+      </w:hyperlink>
     </w:p>
     <w:p>
       <w:pPr>
         <w:pStyle w:val="BodyText"/>
       </w:pPr>
       <w:r>
-        <w:t xml:space="preserve">There will also be available for the students to congregate for each lecture, with a co-instructor present. The room for this semester is B619.</w:t>
-      </w:r>
-    </w:p>
-    <w:bookmarkEnd w:id="24"/>
-    <w:bookmarkStart w:id="27" w:name="faculty-and-staff"/>
+        <w:t xml:space="preserve">There will also be available for the students to congregate for each lecture, with a co-instructor present. The room for this semester is TBD.</w:t>
+      </w:r>
+    </w:p>
+    <w:bookmarkEnd w:id="25"/>
+    <w:bookmarkStart w:id="28" w:name="faculty-and-staff"/>
     <w:p>
       <w:pPr>
         <w:pStyle w:val="Heading2"/>
@@ -189,7 +200,7 @@
       <w:r>
         <w:t xml:space="preserve"> </w:t>
       </w:r>
-      <w:hyperlink r:id="rId25">
+      <w:hyperlink r:id="rId26">
         <w:r>
           <w:rPr>
             <w:rStyle w:val="Hyperlink"/>
@@ -204,7 +215,7 @@
         <w:t xml:space="preserve">Cell Phone: (801) 472-6951</w:t>
       </w:r>
     </w:p>
-    <w:bookmarkStart w:id="26" w:name="office-hours"/>
+    <w:bookmarkStart w:id="27" w:name="office-hours"/>
     <w:p>
       <w:pPr>
         <w:pStyle w:val="Heading3"/>
@@ -231,9 +242,9 @@
         <w:t xml:space="preserve">Dr. Johnson will be available virtually by appointment only. Email or text him any time to set up a time to meet!</w:t>
       </w:r>
     </w:p>
-    <w:bookmarkEnd w:id="26"/>
     <w:bookmarkEnd w:id="27"/>
-    <w:bookmarkStart w:id="43" w:name="github-repository"/>
+    <w:bookmarkEnd w:id="28"/>
+    <w:bookmarkStart w:id="46" w:name="github-repository"/>
     <w:p>
       <w:pPr>
         <w:pStyle w:val="Heading2"/>
@@ -247,10 +258,24 @@
         <w:pStyle w:val="FirstParagraph"/>
       </w:pPr>
       <w:r>
-        <w:t xml:space="preserve">The course GitHub repository is located at: TBD. This page will contain all information in this syllabus plus more. Homework assignments and other information pertinent to this course will be posted on this web site, which will be updated frequently, so you should visit it regularly.</w:t>
-      </w:r>
-    </w:p>
-    <w:bookmarkStart w:id="28" w:name="canvas"/>
+        <w:t xml:space="preserve">The course GitHub repository is located at:</w:t>
+      </w:r>
+      <w:r>
+        <w:t xml:space="preserve"> </w:t>
+      </w:r>
+      <w:hyperlink r:id="rId29">
+        <w:r>
+          <w:rPr>
+            <w:rStyle w:val="Hyperlink"/>
+          </w:rPr>
+          <w:t xml:space="preserve">https://github.com/wevanjohnson/2026_Spring_BMDA</w:t>
+        </w:r>
+      </w:hyperlink>
+      <w:r>
+        <w:t xml:space="preserve">. This page will contain all information in this syllabus plus more. Homework assignments and other information pertinent to this course will be posted on this web site, which will be updated frequently, so you should visit it regularly.</w:t>
+      </w:r>
+    </w:p>
+    <w:bookmarkStart w:id="30" w:name="canvas"/>
     <w:p>
       <w:pPr>
         <w:pStyle w:val="Heading3"/>
@@ -267,8 +292,8 @@
         <w:t xml:space="preserve">There will also be a Canvas course page for this course. This is where you will be able to access links to past lectures, and also turn in your homework (and track your HW grades). The rest of the course materials will only be posted on GitHub.</w:t>
       </w:r>
     </w:p>
-    <w:bookmarkEnd w:id="28"/>
-    <w:bookmarkStart w:id="34" w:name="course-textbooks"/>
+    <w:bookmarkEnd w:id="30"/>
+    <w:bookmarkStart w:id="36" w:name="course-textbooks"/>
     <w:p>
       <w:pPr>
         <w:pStyle w:val="Heading3"/>
@@ -306,7 +331,7 @@
       <w:r>
         <w:t xml:space="preserve"> </w:t>
       </w:r>
-      <w:hyperlink r:id="rId29">
+      <w:hyperlink r:id="rId31">
         <w:r>
           <w:rPr>
             <w:rStyle w:val="Hyperlink"/>
@@ -336,7 +361,7 @@
       <w:r>
         <w:t xml:space="preserve"> </w:t>
       </w:r>
-      <w:hyperlink r:id="rId30">
+      <w:hyperlink r:id="rId32">
         <w:r>
           <w:rPr>
             <w:rStyle w:val="Hyperlink"/>
@@ -366,7 +391,7 @@
       <w:r>
         <w:t xml:space="preserve"> </w:t>
       </w:r>
-      <w:hyperlink r:id="rId31">
+      <w:hyperlink r:id="rId33">
         <w:r>
           <w:rPr>
             <w:rStyle w:val="Hyperlink"/>
@@ -396,7 +421,7 @@
       <w:r>
         <w:t xml:space="preserve"> </w:t>
       </w:r>
-      <w:hyperlink r:id="rId32">
+      <w:hyperlink r:id="rId34">
         <w:r>
           <w:rPr>
             <w:rStyle w:val="Hyperlink"/>
@@ -429,7 +454,7 @@
       <w:r>
         <w:t xml:space="preserve"> </w:t>
       </w:r>
-      <w:hyperlink r:id="rId33">
+      <w:hyperlink r:id="rId35">
         <w:r>
           <w:rPr>
             <w:rStyle w:val="Hyperlink"/>
@@ -438,8 +463,8 @@
         </w:r>
       </w:hyperlink>
     </w:p>
-    <w:bookmarkEnd w:id="34"/>
-    <w:bookmarkStart w:id="37" w:name="evaluation-methods-course-grading"/>
+    <w:bookmarkEnd w:id="36"/>
+    <w:bookmarkStart w:id="39" w:name="evaluation-methods-course-grading"/>
     <w:p>
       <w:pPr>
         <w:pStyle w:val="Heading3"/>
@@ -448,7 +473,7 @@
         <w:t xml:space="preserve">EVALUATION METHODS &amp; COURSE GRADING</w:t>
       </w:r>
     </w:p>
-    <w:bookmarkStart w:id="35" w:name="assessmentevaluation"/>
+    <w:bookmarkStart w:id="37" w:name="assessmentevaluation"/>
     <w:p>
       <w:pPr>
         <w:pStyle w:val="Heading4"/>
@@ -465,8 +490,8 @@
         <w:t xml:space="preserve">This course is a hands-on, project-based course. You will be graded based on homework assignments/mini projects (70%) and your final project (30%; there will be no final exam). Homework assignments and mini projects will be usually assigned at the beginning of each week and will be due by Wednesday of the week after the material is covered. However, please plan to be flexible on due dates based on the material covered in class.</w:t>
       </w:r>
     </w:p>
-    <w:bookmarkEnd w:id="35"/>
-    <w:bookmarkStart w:id="36" w:name="course-grading"/>
+    <w:bookmarkEnd w:id="37"/>
+    <w:bookmarkStart w:id="38" w:name="course-grading"/>
     <w:p>
       <w:pPr>
         <w:pStyle w:val="Heading4"/>
@@ -679,9 +704,9 @@
         </w:tc>
       </w:tr>
     </w:tbl>
-    <w:bookmarkEnd w:id="36"/>
-    <w:bookmarkEnd w:id="37"/>
-    <w:bookmarkStart w:id="38" w:name="attendance"/>
+    <w:bookmarkEnd w:id="38"/>
+    <w:bookmarkEnd w:id="39"/>
+    <w:bookmarkStart w:id="40" w:name="attendance"/>
     <w:p>
       <w:pPr>
         <w:pStyle w:val="Heading3"/>
@@ -698,8 +723,8 @@
         <w:t xml:space="preserve">This course is being taught through a synchronous remote modality through Zoom. Attendance is mandatory; lecture recordings will only be available to students with university approved absences or pre-approved special circumstances. If you are sick or have any other justified reason to miss a lecture, please reach out to Dr. Johnson in advance and you will be reasonably accommodated.</w:t>
       </w:r>
     </w:p>
-    <w:bookmarkEnd w:id="38"/>
-    <w:bookmarkStart w:id="39" w:name="workload"/>
+    <w:bookmarkEnd w:id="40"/>
+    <w:bookmarkStart w:id="41" w:name="workload"/>
     <w:p>
       <w:pPr>
         <w:pStyle w:val="Heading3"/>
@@ -716,8 +741,8 @@
         <w:t xml:space="preserve">This is an 8-week, 2.0 credit class near the end of Spring 2025. In general, you should expect four hours of in class each week, and two hours outside of class for every hour in class.</w:t>
       </w:r>
     </w:p>
-    <w:bookmarkEnd w:id="39"/>
-    <w:bookmarkStart w:id="40" w:name="other-help"/>
+    <w:bookmarkEnd w:id="41"/>
+    <w:bookmarkStart w:id="42" w:name="other-help"/>
     <w:p>
       <w:pPr>
         <w:pStyle w:val="Heading3"/>
@@ -750,8 +775,8 @@
         <w:t xml:space="preserve">encourage you to contact early me if you have difficulty with the material. This course builds on material from prior lectures, so do not fall behind! My job is to help you understand the material as well as possible, and I am flexible with meeting times.</w:t>
       </w:r>
     </w:p>
-    <w:bookmarkEnd w:id="40"/>
-    <w:bookmarkStart w:id="42" w:name="academic-integrity"/>
+    <w:bookmarkEnd w:id="42"/>
+    <w:bookmarkStart w:id="44" w:name="academic-integrity"/>
     <w:p>
       <w:pPr>
         <w:pStyle w:val="Heading3"/>
@@ -767,7 +792,7 @@
       <w:r>
         <w:t xml:space="preserve">You are expected to have read and follow the guidelines at the university’s academic integrity website (</w:t>
       </w:r>
-      <w:hyperlink r:id="rId41">
+      <w:hyperlink r:id="rId43">
         <w:r>
           <w:rPr>
             <w:rStyle w:val="Hyperlink"/>
@@ -838,8 +863,353 @@
         <w:t xml:space="preserve">Violations of academic integrity will be treated in accordance with university policy, and sanctions for violations may range from no credit for the assignment, to a failing course grade to (for the most severe violations) dismissal from the university.</w:t>
       </w:r>
     </w:p>
-    <w:bookmarkEnd w:id="42"/>
-    <w:bookmarkEnd w:id="43"/>
+    <w:p>
+      <w:r>
+        <w:br w:type="page"/>
+      </w:r>
+    </w:p>
+    <w:bookmarkEnd w:id="44"/>
+    <w:bookmarkStart w:id="45" w:name="Xb445eeffe597b6da678441faaf2161d7d3158e0"/>
+    <w:p>
+      <w:pPr>
+        <w:pStyle w:val="Heading3"/>
+      </w:pPr>
+      <w:r>
+        <w:t xml:space="preserve">COURSE TOPICS AND OUTLINE (BY WEEK; MAY BE MODIFIED AS NEEDED)</w:t>
+      </w:r>
+    </w:p>
+    <w:p>
+      <w:pPr>
+        <w:pStyle w:val="FirstParagraph"/>
+      </w:pPr>
+      <w:r>
+        <w:t xml:space="preserve">Introduction: Sequencing data formats and quality control (Week 1)</w:t>
+      </w:r>
+    </w:p>
+    <w:p>
+      <w:pPr>
+        <w:pStyle w:val="Compact"/>
+        <w:numPr>
+          <w:ilvl w:val="0"/>
+          <w:numId w:val="1004"/>
+        </w:numPr>
+      </w:pPr>
+      <w:r>
+        <w:t xml:space="preserve">4/22/26: Course introduction; Essential tools for Data Science</w:t>
+      </w:r>
+    </w:p>
+    <w:p>
+      <w:pPr>
+        <w:pStyle w:val="FirstParagraph"/>
+      </w:pPr>
+      <w:r>
+        <w:t xml:space="preserve">Sequencing data formats and quality control; Genomics data analysis and wranglin (Week 2)</w:t>
+      </w:r>
+    </w:p>
+    <w:p>
+      <w:pPr>
+        <w:pStyle w:val="Compact"/>
+        <w:numPr>
+          <w:ilvl w:val="0"/>
+          <w:numId w:val="1005"/>
+        </w:numPr>
+      </w:pPr>
+      <w:r>
+        <w:t xml:space="preserve">4/27/26: Data formats (.fasta, .fastq, .sam/.bam); FASTQC and multiQC</w:t>
+      </w:r>
+    </w:p>
+    <w:p>
+      <w:pPr>
+        <w:pStyle w:val="Compact"/>
+        <w:numPr>
+          <w:ilvl w:val="0"/>
+          <w:numId w:val="1005"/>
+        </w:numPr>
+      </w:pPr>
+      <w:r>
+        <w:t xml:space="preserve">4/29/26: Sequence trimming and QC; alignment and wrangling</w:t>
+      </w:r>
+      <w:r>
+        <w:t xml:space="preserve"> </w:t>
+      </w:r>
+      <w:r>
+        <w:rPr>
+          <w:b/>
+          <w:bCs/>
+        </w:rPr>
+        <w:t xml:space="preserve">(asynchronous lecture)</w:t>
+      </w:r>
+      <w:r>
+        <w:t xml:space="preserve"> </w:t>
+      </w:r>
+      <w:r>
+        <w:rPr>
+          <w:b/>
+          <w:bCs/>
+        </w:rPr>
+        <w:t xml:space="preserve">In Person</w:t>
+      </w:r>
+    </w:p>
+    <w:p>
+      <w:pPr>
+        <w:pStyle w:val="FirstParagraph"/>
+      </w:pPr>
+      <w:r>
+        <w:t xml:space="preserve">Data wrangling and variation analysis (Week 2)</w:t>
+      </w:r>
+    </w:p>
+    <w:p>
+      <w:pPr>
+        <w:pStyle w:val="Compact"/>
+        <w:numPr>
+          <w:ilvl w:val="0"/>
+          <w:numId w:val="1006"/>
+        </w:numPr>
+      </w:pPr>
+      <w:r>
+        <w:t xml:space="preserve">4/30/25: Genomic sequence variation analysis</w:t>
+      </w:r>
+      <w:r>
+        <w:t xml:space="preserve"> </w:t>
+      </w:r>
+      <w:r>
+        <w:rPr>
+          <w:b/>
+          <w:bCs/>
+        </w:rPr>
+        <w:t xml:space="preserve">(asynchronous lecture)</w:t>
+      </w:r>
+    </w:p>
+    <w:p>
+      <w:pPr>
+        <w:pStyle w:val="FirstParagraph"/>
+      </w:pPr>
+      <w:r>
+        <w:t xml:space="preserve">Genomics data analysis: Linkage and genome-wide association (GWAS) (Week 3)</w:t>
+      </w:r>
+    </w:p>
+    <w:p>
+      <w:pPr>
+        <w:pStyle w:val="Compact"/>
+        <w:numPr>
+          <w:ilvl w:val="0"/>
+          <w:numId w:val="1007"/>
+        </w:numPr>
+      </w:pPr>
+      <w:r>
+        <w:t xml:space="preserve">5/5/24: Linkage analysis; Phylogenetic trees</w:t>
+      </w:r>
+    </w:p>
+    <w:p>
+      <w:pPr>
+        <w:pStyle w:val="Compact"/>
+        <w:numPr>
+          <w:ilvl w:val="0"/>
+          <w:numId w:val="1007"/>
+        </w:numPr>
+      </w:pPr>
+      <w:r>
+        <w:t xml:space="preserve">5/7/24: Genome-wide association testing</w:t>
+      </w:r>
+    </w:p>
+    <w:p>
+      <w:pPr>
+        <w:pStyle w:val="FirstParagraph"/>
+      </w:pPr>
+      <w:r>
+        <w:t xml:space="preserve">Gene expression and proteomics analysis (Week 4)</w:t>
+      </w:r>
+    </w:p>
+    <w:p>
+      <w:pPr>
+        <w:pStyle w:val="Compact"/>
+        <w:numPr>
+          <w:ilvl w:val="0"/>
+          <w:numId w:val="1008"/>
+        </w:numPr>
+      </w:pPr>
+      <w:r>
+        <w:t xml:space="preserve">5/12/24: Quantitative trait analysis</w:t>
+      </w:r>
+    </w:p>
+    <w:p>
+      <w:pPr>
+        <w:pStyle w:val="Compact"/>
+        <w:numPr>
+          <w:ilvl w:val="0"/>
+          <w:numId w:val="1008"/>
+        </w:numPr>
+      </w:pPr>
+      <w:r>
+        <w:t xml:space="preserve">5/14/24: Clustering/heatmaps; Dimension reduction</w:t>
+      </w:r>
+      <w:r>
+        <w:t xml:space="preserve"> </w:t>
+      </w:r>
+      <w:r>
+        <w:rPr>
+          <w:b/>
+          <w:bCs/>
+        </w:rPr>
+        <w:t xml:space="preserve">In Person</w:t>
+      </w:r>
+    </w:p>
+    <w:p>
+      <w:pPr>
+        <w:pStyle w:val="FirstParagraph"/>
+      </w:pPr>
+      <w:r>
+        <w:t xml:space="preserve">Gene expression and proteomics analysis; Network analysis (Week 5)</w:t>
+      </w:r>
+    </w:p>
+    <w:p>
+      <w:pPr>
+        <w:pStyle w:val="Compact"/>
+        <w:numPr>
+          <w:ilvl w:val="0"/>
+          <w:numId w:val="1009"/>
+        </w:numPr>
+      </w:pPr>
+      <w:r>
+        <w:t xml:space="preserve">5/19/24: Batch correction; Differential expression analysis</w:t>
+      </w:r>
+    </w:p>
+    <w:p>
+      <w:pPr>
+        <w:pStyle w:val="Compact"/>
+        <w:numPr>
+          <w:ilvl w:val="0"/>
+          <w:numId w:val="1009"/>
+        </w:numPr>
+      </w:pPr>
+      <w:r>
+        <w:t xml:space="preserve">5/21/24: Pathway/network analysis</w:t>
+      </w:r>
+    </w:p>
+    <w:p>
+      <w:pPr>
+        <w:pStyle w:val="FirstParagraph"/>
+      </w:pPr>
+      <w:r>
+        <w:t xml:space="preserve">Single cell and epigenetic data analysis (Week 6)</w:t>
+      </w:r>
+    </w:p>
+    <w:p>
+      <w:pPr>
+        <w:pStyle w:val="Compact"/>
+        <w:numPr>
+          <w:ilvl w:val="0"/>
+          <w:numId w:val="1010"/>
+        </w:numPr>
+      </w:pPr>
+      <w:r>
+        <w:t xml:space="preserve">5/26/25: Single cell RNA-seq analysis</w:t>
+      </w:r>
+      <w:r>
+        <w:t xml:space="preserve"> </w:t>
+      </w:r>
+      <w:r>
+        <w:rPr>
+          <w:b/>
+          <w:bCs/>
+        </w:rPr>
+        <w:t xml:space="preserve">(Memorial Day; asynchronous lecture)</w:t>
+      </w:r>
+    </w:p>
+    <w:p>
+      <w:pPr>
+        <w:pStyle w:val="Compact"/>
+        <w:numPr>
+          <w:ilvl w:val="0"/>
+          <w:numId w:val="1010"/>
+        </w:numPr>
+      </w:pPr>
+      <w:r>
+        <w:t xml:space="preserve">5/28/25: Bump hunting/peak finding; Regulatory network analysis</w:t>
+      </w:r>
+      <w:r>
+        <w:t xml:space="preserve"> </w:t>
+      </w:r>
+      <w:r>
+        <w:rPr>
+          <w:b/>
+          <w:bCs/>
+        </w:rPr>
+        <w:t xml:space="preserve">(asynchronous lecture)</w:t>
+      </w:r>
+    </w:p>
+    <w:p>
+      <w:pPr>
+        <w:pStyle w:val="FirstParagraph"/>
+      </w:pPr>
+      <w:r>
+        <w:t xml:space="preserve">Microbiome data analysis (Week 7)</w:t>
+      </w:r>
+    </w:p>
+    <w:p>
+      <w:pPr>
+        <w:pStyle w:val="Compact"/>
+        <w:numPr>
+          <w:ilvl w:val="0"/>
+          <w:numId w:val="1011"/>
+        </w:numPr>
+      </w:pPr>
+      <w:r>
+        <w:t xml:space="preserve">6/2/25: Diversity analysis; Dimension reduction</w:t>
+      </w:r>
+    </w:p>
+    <w:p>
+      <w:pPr>
+        <w:pStyle w:val="Compact"/>
+        <w:numPr>
+          <w:ilvl w:val="0"/>
+          <w:numId w:val="1011"/>
+        </w:numPr>
+      </w:pPr>
+      <w:r>
+        <w:t xml:space="preserve">6/4/25: Differential abundance; Co-occurrence and functional analyses; Final Projects Due</w:t>
+      </w:r>
+    </w:p>
+    <w:p>
+      <w:pPr>
+        <w:pStyle w:val="FirstParagraph"/>
+      </w:pPr>
+      <w:r>
+        <w:t xml:space="preserve">Imaging and spatial data analysis (Week 8)</w:t>
+      </w:r>
+    </w:p>
+    <w:p>
+      <w:pPr>
+        <w:pStyle w:val="Compact"/>
+        <w:numPr>
+          <w:ilvl w:val="0"/>
+          <w:numId w:val="1012"/>
+        </w:numPr>
+      </w:pPr>
+      <w:r>
+        <w:t xml:space="preserve">6/9/25: Types of imaging data; Tools for image analysis</w:t>
+      </w:r>
+    </w:p>
+    <w:p>
+      <w:pPr>
+        <w:pStyle w:val="Compact"/>
+        <w:numPr>
+          <w:ilvl w:val="0"/>
+          <w:numId w:val="1012"/>
+        </w:numPr>
+      </w:pPr>
+      <w:r>
+        <w:t xml:space="preserve">6/11/25: Pattern recognition and machine learning</w:t>
+      </w:r>
+      <w:r>
+        <w:t xml:space="preserve"> </w:t>
+      </w:r>
+      <w:r>
+        <w:t xml:space="preserve">–&gt;</w:t>
+      </w:r>
+    </w:p>
+    <w:bookmarkEnd w:id="45"/>
+    <w:bookmarkEnd w:id="46"/>
     <w:sectPr>
       <w:footnotePr>
         <w:numRestart w:val="eachSect"/>
@@ -1202,6 +1572,33 @@
     </w:lvlOverride>
   </w:num>
   <w:num w:numId="1003">
+    <w:abstractNumId w:val="991"/>
+  </w:num>
+  <w:num w:numId="1004">
+    <w:abstractNumId w:val="991"/>
+  </w:num>
+  <w:num w:numId="1005">
+    <w:abstractNumId w:val="991"/>
+  </w:num>
+  <w:num w:numId="1006">
+    <w:abstractNumId w:val="991"/>
+  </w:num>
+  <w:num w:numId="1007">
+    <w:abstractNumId w:val="991"/>
+  </w:num>
+  <w:num w:numId="1008">
+    <w:abstractNumId w:val="991"/>
+  </w:num>
+  <w:num w:numId="1009">
+    <w:abstractNumId w:val="991"/>
+  </w:num>
+  <w:num w:numId="1010">
+    <w:abstractNumId w:val="991"/>
+  </w:num>
+  <w:num w:numId="1011">
+    <w:abstractNumId w:val="991"/>
+  </w:num>
+  <w:num w:numId="1012">
     <w:abstractNumId w:val="991"/>
   </w:num>
 </w:numbering>

</xml_diff>